<commit_message>
Adicionando: Modificações na Interface
</commit_message>
<xml_diff>
--- a/assets/templates/bpc_template_unificado.docx
+++ b/assets/templates/bpc_template_unificado.docx
@@ -4154,8 +4154,6 @@
       <w:r>
         <w:t>{%p endif %}</w:t>
       </w:r>
-      <w:bookmarkStart w:id="0" w:name="_GoBack"/>
-      <w:bookmarkEnd w:id="0"/>
     </w:p>
     <w:p>
       <w:pPr>
@@ -4494,7 +4492,7 @@
           <w:szCs w:val="24"/>
         </w:rPr>
       </w:pPr>
-      <w:bookmarkStart w:id="1" w:name="_Hlk217633236"/>
+      <w:bookmarkStart w:id="0" w:name="_Hlk217633236"/>
       <w:r>
         <w:rPr>
           <w:sz w:val="24"/>
@@ -4538,7 +4536,7 @@
         </w:rPr>
         <w:t>O perigo de dano se configura pelo fato de que, se continuar sem receber o benefício, a autora terá sua subsistência prejudicada, uma vez que o benefício tem caráter alimentar.</w:t>
       </w:r>
-      <w:bookmarkEnd w:id="1"/>
+      <w:bookmarkEnd w:id="0"/>
     </w:p>
     <w:p>
       <w:pPr>
@@ -4834,7 +4832,7 @@
         </w:rPr>
         <w:t xml:space="preserve">Inicialmente, insta informar que a parte Autora possui deficiência de longo prazo que limita significamente, o prejudicando fisicamente e socialmente em tarefas do dia a dia, deixando-o em desigualdade em face aos demais da sua idade. Nesse sentido, a parte Autora necessita acompanhamento médico e uso de medicações para controlar seu quadro </w:t>
       </w:r>
-      <w:bookmarkStart w:id="2" w:name="_Hlk198815936"/>
+      <w:bookmarkStart w:id="1" w:name="_Hlk198815936"/>
       <w:r>
         <w:rPr>
           <w:sz w:val="24"/>
@@ -4842,7 +4840,7 @@
         </w:rPr>
         <w:t>clínico</w:t>
       </w:r>
-      <w:bookmarkEnd w:id="2"/>
+      <w:bookmarkEnd w:id="1"/>
       <w:r>
         <w:rPr>
           <w:sz w:val="24"/>
@@ -6309,30 +6307,122 @@
     </w:p>
     <w:p>
       <w:pPr>
-        <w:spacing w:before="240" w:line="360" w:lineRule="auto"/>
-        <w:ind w:right="439" w:firstLine="720"/>
-        <w:jc w:val="both"/>
-        <w:rPr>
-          <w:sz w:val="24"/>
-          <w:szCs w:val="24"/>
-        </w:rPr>
-      </w:pPr>
-      <w:r>
-        <w:rPr>
-          <w:sz w:val="24"/>
-          <w:szCs w:val="24"/>
-        </w:rPr>
-        <w:t xml:space="preserve">Quanto o núcleo familiar é composto por </w:t>
-      </w:r>
-      <w:r>
-        <w:t>{{ descricao_grupo_familiar }}</w:t>
-      </w:r>
-      <w:r>
-        <w:rPr>
-          <w:sz w:val="24"/>
-          <w:szCs w:val="24"/>
-        </w:rPr>
-        <w:t xml:space="preserve"> pessoas, a sua moradia é modesta e não atende às suas necessidades, possui poucos móveis, somente o necessário e não há luxuosidade.</w:t>
+        <w:spacing w:line="360" w:lineRule="auto"/>
+        <w:ind w:right="439"/>
+        <w:jc w:val="both"/>
+        <w:rPr>
+          <w:sz w:val="24"/>
+          <w:szCs w:val="24"/>
+        </w:rPr>
+      </w:pPr>
+      <w:r>
+        <w:rPr>
+          <w:sz w:val="24"/>
+          <w:szCs w:val="24"/>
+        </w:rPr>
+        <w:t>{%p if descricao_grupo_familiar == '1' or descricao_grupo_familiar == 'uma' or descricao_grupo_familiar == 'Uma' %}</w:t>
+      </w:r>
+      <w:bookmarkStart w:id="2" w:name="_GoBack"/>
+      <w:bookmarkEnd w:id="2"/>
+    </w:p>
+    <w:p>
+      <w:pPr>
+        <w:spacing w:line="360" w:lineRule="auto"/>
+        <w:ind w:right="439" w:firstLine="851"/>
+        <w:jc w:val="both"/>
+        <w:rPr>
+          <w:sz w:val="24"/>
+          <w:szCs w:val="24"/>
+        </w:rPr>
+      </w:pPr>
+      <w:r>
+        <w:rPr>
+          <w:sz w:val="24"/>
+          <w:szCs w:val="24"/>
+        </w:rPr>
+        <w:t>A parte autora reside sozinha</w:t>
+      </w:r>
+      <w:r>
+        <w:rPr>
+          <w:sz w:val="24"/>
+          <w:szCs w:val="24"/>
+        </w:rPr>
+        <w:t>, a</w:t>
+      </w:r>
+      <w:r>
+        <w:rPr>
+          <w:sz w:val="24"/>
+          <w:szCs w:val="24"/>
+        </w:rPr>
+        <w:t xml:space="preserve"> sua moradia é modesta e não atende às suas necessidades, possui poucos móveis, somente o necessário e não há luxuosidade.</w:t>
+      </w:r>
+    </w:p>
+    <w:p>
+      <w:pPr>
+        <w:spacing w:line="360" w:lineRule="auto"/>
+        <w:ind w:right="439"/>
+        <w:jc w:val="both"/>
+        <w:rPr>
+          <w:sz w:val="24"/>
+          <w:szCs w:val="24"/>
+        </w:rPr>
+      </w:pPr>
+      <w:r>
+        <w:rPr>
+          <w:sz w:val="24"/>
+          <w:szCs w:val="24"/>
+        </w:rPr>
+        <w:t>{%p else %}</w:t>
+      </w:r>
+    </w:p>
+    <w:p>
+      <w:pPr>
+        <w:spacing w:line="360" w:lineRule="auto"/>
+        <w:ind w:left="142" w:right="439" w:firstLine="567"/>
+        <w:jc w:val="both"/>
+        <w:rPr>
+          <w:sz w:val="24"/>
+          <w:szCs w:val="24"/>
+        </w:rPr>
+      </w:pPr>
+      <w:r>
+        <w:rPr>
+          <w:sz w:val="24"/>
+          <w:szCs w:val="24"/>
+        </w:rPr>
+        <w:t>O núcleo familiar é composto por {{ descricao_grupo_familiar }} pessoas</w:t>
+      </w:r>
+      <w:r>
+        <w:rPr>
+          <w:sz w:val="24"/>
+          <w:szCs w:val="24"/>
+        </w:rPr>
+        <w:t>, a</w:t>
+      </w:r>
+      <w:r>
+        <w:rPr>
+          <w:sz w:val="24"/>
+          <w:szCs w:val="24"/>
+        </w:rPr>
+        <w:t xml:space="preserve"> sua moradia é modesta e não atende às suas necessidades, possui poucos móveis, somente o necessário e não há luxuosidade.</w:t>
+      </w:r>
+    </w:p>
+    <w:p>
+      <w:pPr>
+        <w:spacing w:line="360" w:lineRule="auto"/>
+        <w:ind w:right="439"/>
+        <w:jc w:val="both"/>
+        <w:rPr>
+          <w:sz w:val="24"/>
+          <w:szCs w:val="24"/>
+        </w:rPr>
+      </w:pPr>
+      <w:r>
+        <w:rPr>
+          <w:sz w:val="24"/>
+          <w:szCs w:val="24"/>
+        </w:rPr>
+        <w:t>{%p endif %}</w:t>
       </w:r>
     </w:p>
     <w:p>
@@ -6507,6 +6597,7 @@
           <w:sz w:val="24"/>
           <w:szCs w:val="24"/>
         </w:rPr>
+        <w:lastRenderedPageBreak/>
         <w:t>Portanto, diante de todo o exposto, o Requerente vem requerer que seja concedido o benefício assistencial de prestação continuada ao idoso, na qual faz jus aos requisitos do benefício.</w:t>
       </w:r>
     </w:p>
@@ -7036,6 +7127,7 @@
           <w:sz w:val="24"/>
           <w:szCs w:val="24"/>
         </w:rPr>
+        <w:lastRenderedPageBreak/>
         <w:t xml:space="preserve">Guaraciaba do Norte – CE, </w:t>
       </w:r>
       <w:r>
@@ -7065,7 +7157,7 @@
           <w:sz w:val="24"/>
           <w:szCs w:val="24"/>
         </w:rPr>
-        <w:t>5 de agosto de 2026</w:t>
+        <w:t>6 de agosto de 2026</w:t>
       </w:r>
       <w:r>
         <w:rPr>
@@ -11643,7 +11735,7 @@
 </file>
 
 <file path=customXml/itemProps1.xml><?xml version="1.0" encoding="utf-8"?>
-<ds:datastoreItem xmlns:ds="http://schemas.openxmlformats.org/officeDocument/2006/customXml" ds:itemID="{2660DE28-5179-4E4A-B89B-AE6C175857B5}">
+<ds:datastoreItem xmlns:ds="http://schemas.openxmlformats.org/officeDocument/2006/customXml" ds:itemID="{1D19EBF5-5C6D-4437-88B7-0E550F0DC66B}">
   <ds:schemaRefs>
     <ds:schemaRef ds:uri="http://schemas.openxmlformats.org/officeDocument/2006/bibliography"/>
   </ds:schemaRefs>

</xml_diff>